<commit_message>
Informe final: 21 hallazgos corregidos con verificacion independiente
</commit_message>
<xml_diff>
--- a/docs/Informe_Tecnico_data-center_UPSE.docx
+++ b/docs/Informe_Tecnico_data-center_UPSE.docx
@@ -3378,7 +3378,7 @@
           <w:sz w:val="24"/>
           <w:szCs w:val="24"/>
         </w:rPr>
-        <w:t xml:space="preserve">Una vez el servicio estuvo en producción se realizó una auditoría en cuatro capas: un escaneo externo de la URL pública con Cloudflare URL Scanner —que reporta las cabeceras de respuesta y las peticiones que hace el sitio— y una revisión manual del código del frontend, de la API, de los Dockerfiles y del docker-compose.yml. Se detectaron 19 hallazgos y se corrigieron todos. Las tablas siguientes resumen cada uno con su evidencia de verificación.</w:t>
+        <w:t xml:space="preserve">Una vez el servicio estuvo en producción se realizó una auditoría en cuatro capas: un escaneo externo de la URL pública con Cloudflare URL Scanner —que reporta las cabeceras de respuesta y las peticiones que hace el sitio— y una revisión manual del código del frontend, de la API, de los Dockerfiles y del docker-compose.yml. Se detectaron 19 hallazgos y se corrigieron todos; una verificación independiente posterior (5.8) añadió dos residuos más, también resueltos. Las tablas siguientes resumen cada uno con su evidencia de verificación.</w:t>
       </w:r>
     </w:p>
     <w:p>
@@ -6720,6 +6720,484 @@
       </w:r>
     </w:p>
     <w:p>
+      <w:pPr>
+        <w:pStyle w:val="Heading2"/>
+        <w:spacing w:after="160" w:before="240"/>
+      </w:pPr>
+      <w:r>
+        <w:rPr>
+          <w:rFonts w:ascii="Times New Roman" w:cs="Times New Roman" w:eastAsia="Times New Roman" w:hAnsi="Times New Roman"/>
+          <w:b/>
+          <w:bCs/>
+          <w:color w:val="1F3864"/>
+          <w:sz w:val="26"/>
+          <w:szCs w:val="26"/>
+        </w:rPr>
+        <w:t xml:space="preserve">5.8 Verificación independiente posterior</w:t>
+      </w:r>
+    </w:p>
+    <w:p>
+      <w:pPr>
+        <w:spacing w:after="160" w:line="320"/>
+        <w:jc w:val="both"/>
+      </w:pPr>
+      <w:r>
+        <w:rPr>
+          <w:rFonts w:ascii="Times New Roman" w:cs="Times New Roman" w:eastAsia="Times New Roman" w:hAnsi="Times New Roman"/>
+          <w:sz w:val="24"/>
+          <w:szCs w:val="24"/>
+        </w:rPr>
+        <w:t xml:space="preserve">Terminadas las correcciones se repitió el escaneo externo con Cloudflare URL Scanner, esta vez sobre la URL HTTPS, para comprobar los resultados con una herramienta ajena al propio despliegue. El informe confirmó: securityState "secure" en todas las peticiones, con TLS 1.3 y cifrado AES-256-GCM y certificado emitido para 3-144-146-133.nip.io; las once cabeceras de seguridad presentes en todos los recursos (HTML, CSS, JS, API y favicon) y no solo en la página principal; Server: nginx sin número de versión; Cache-Control: no-store en la API; las cabeceras RateLimit (limit=120, remaining=119, reset=60) confirmando el limitador; y ningún veredicto malicioso ni categoría de riesgo.</w:t>
+      </w:r>
+    </w:p>
+    <w:p>
+      <w:pPr>
+        <w:spacing w:after="160" w:line="320"/>
+        <w:jc w:val="both"/>
+      </w:pPr>
+      <w:r>
+        <w:rPr>
+          <w:rFonts w:ascii="Times New Roman" w:cs="Times New Roman" w:eastAsia="Times New Roman" w:hAnsi="Times New Roman"/>
+          <w:sz w:val="24"/>
+          <w:szCs w:val="24"/>
+        </w:rPr>
+        <w:t xml:space="preserve">El re-escaneo detectó además dos residuos que no aparecían en la primera pasada y que también se corrigieron:</w:t>
+      </w:r>
+    </w:p>
+    <w:tbl>
+      <w:tblPr>
+        <w:tblW w:type="dxa" w:w="9000"/>
+        <w:tblBorders>
+          <w:top w:val="single" w:color="auto" w:sz="4"/>
+          <w:left w:val="single" w:color="auto" w:sz="4"/>
+          <w:bottom w:val="single" w:color="auto" w:sz="4"/>
+          <w:right w:val="single" w:color="auto" w:sz="4"/>
+          <w:insideH w:val="single" w:color="auto" w:sz="4"/>
+          <w:insideV w:val="single" w:color="auto" w:sz="4"/>
+        </w:tblBorders>
+      </w:tblPr>
+      <w:tblGrid>
+        <w:gridCol w:w="420"/>
+        <w:gridCol w:w="2100"/>
+        <w:gridCol w:w="1500"/>
+        <w:gridCol w:w="3200"/>
+        <w:gridCol w:w="1780"/>
+      </w:tblGrid>
+      <w:tr>
+        <w:trPr>
+          <w:tblHeader/>
+        </w:trPr>
+        <w:tc>
+          <w:tcPr>
+            <w:tcW w:type="dxa" w:w="420"/>
+            <w:shd w:fill="1F3864" w:val="clear"/>
+            <w:tcMar>
+              <w:top w:type="dxa" w:w="70"/>
+              <w:left w:type="dxa" w:w="90"/>
+              <w:bottom w:type="dxa" w:w="70"/>
+              <w:right w:type="dxa" w:w="90"/>
+            </w:tcMar>
+          </w:tcPr>
+          <w:p>
+            <w:pPr>
+              <w:jc w:val="center"/>
+            </w:pPr>
+            <w:r>
+              <w:rPr>
+                <w:rFonts w:ascii="Times New Roman" w:cs="Times New Roman" w:eastAsia="Times New Roman" w:hAnsi="Times New Roman"/>
+                <w:b/>
+                <w:bCs/>
+                <w:color w:val="FFFFFF"/>
+                <w:sz w:val="20"/>
+                <w:szCs w:val="20"/>
+              </w:rPr>
+              <w:t xml:space="preserve">#</w:t>
+            </w:r>
+          </w:p>
+        </w:tc>
+        <w:tc>
+          <w:tcPr>
+            <w:tcW w:type="dxa" w:w="2100"/>
+            <w:shd w:fill="1F3864" w:val="clear"/>
+            <w:tcMar>
+              <w:top w:type="dxa" w:w="70"/>
+              <w:left w:type="dxa" w:w="90"/>
+              <w:bottom w:type="dxa" w:w="70"/>
+              <w:right w:type="dxa" w:w="90"/>
+            </w:tcMar>
+          </w:tcPr>
+          <w:p>
+            <w:pPr>
+              <w:jc w:val="center"/>
+            </w:pPr>
+            <w:r>
+              <w:rPr>
+                <w:rFonts w:ascii="Times New Roman" w:cs="Times New Roman" w:eastAsia="Times New Roman" w:hAnsi="Times New Roman"/>
+                <w:b/>
+                <w:bCs/>
+                <w:color w:val="FFFFFF"/>
+                <w:sz w:val="20"/>
+                <w:szCs w:val="20"/>
+              </w:rPr>
+              <w:t xml:space="preserve">Hallazgo</w:t>
+            </w:r>
+          </w:p>
+        </w:tc>
+        <w:tc>
+          <w:tcPr>
+            <w:tcW w:type="dxa" w:w="1500"/>
+            <w:shd w:fill="1F3864" w:val="clear"/>
+            <w:tcMar>
+              <w:top w:type="dxa" w:w="70"/>
+              <w:left w:type="dxa" w:w="90"/>
+              <w:bottom w:type="dxa" w:w="70"/>
+              <w:right w:type="dxa" w:w="90"/>
+            </w:tcMar>
+          </w:tcPr>
+          <w:p>
+            <w:pPr>
+              <w:jc w:val="center"/>
+            </w:pPr>
+            <w:r>
+              <w:rPr>
+                <w:rFonts w:ascii="Times New Roman" w:cs="Times New Roman" w:eastAsia="Times New Roman" w:hAnsi="Times New Roman"/>
+                <w:b/>
+                <w:bCs/>
+                <w:color w:val="FFFFFF"/>
+                <w:sz w:val="20"/>
+                <w:szCs w:val="20"/>
+              </w:rPr>
+              <w:t xml:space="preserve">Riesgo</w:t>
+            </w:r>
+          </w:p>
+        </w:tc>
+        <w:tc>
+          <w:tcPr>
+            <w:tcW w:type="dxa" w:w="3200"/>
+            <w:shd w:fill="1F3864" w:val="clear"/>
+            <w:tcMar>
+              <w:top w:type="dxa" w:w="70"/>
+              <w:left w:type="dxa" w:w="90"/>
+              <w:bottom w:type="dxa" w:w="70"/>
+              <w:right w:type="dxa" w:w="90"/>
+            </w:tcMar>
+          </w:tcPr>
+          <w:p>
+            <w:pPr>
+              <w:jc w:val="center"/>
+            </w:pPr>
+            <w:r>
+              <w:rPr>
+                <w:rFonts w:ascii="Times New Roman" w:cs="Times New Roman" w:eastAsia="Times New Roman" w:hAnsi="Times New Roman"/>
+                <w:b/>
+                <w:bCs/>
+                <w:color w:val="FFFFFF"/>
+                <w:sz w:val="20"/>
+                <w:szCs w:val="20"/>
+              </w:rPr>
+              <w:t xml:space="preserve">Corrección aplicada</w:t>
+            </w:r>
+          </w:p>
+        </w:tc>
+        <w:tc>
+          <w:tcPr>
+            <w:tcW w:type="dxa" w:w="1780"/>
+            <w:shd w:fill="1F3864" w:val="clear"/>
+            <w:tcMar>
+              <w:top w:type="dxa" w:w="70"/>
+              <w:left w:type="dxa" w:w="90"/>
+              <w:bottom w:type="dxa" w:w="70"/>
+              <w:right w:type="dxa" w:w="90"/>
+            </w:tcMar>
+          </w:tcPr>
+          <w:p>
+            <w:pPr>
+              <w:jc w:val="center"/>
+            </w:pPr>
+            <w:r>
+              <w:rPr>
+                <w:rFonts w:ascii="Times New Roman" w:cs="Times New Roman" w:eastAsia="Times New Roman" w:hAnsi="Times New Roman"/>
+                <w:b/>
+                <w:bCs/>
+                <w:color w:val="FFFFFF"/>
+                <w:sz w:val="20"/>
+                <w:szCs w:val="20"/>
+              </w:rPr>
+              <w:t xml:space="preserve">Verificación</w:t>
+            </w:r>
+          </w:p>
+        </w:tc>
+      </w:tr>
+      <w:tr>
+        <w:tc>
+          <w:tcPr>
+            <w:tcW w:type="dxa" w:w="420"/>
+            <w:tcMar>
+              <w:top w:type="dxa" w:w="70"/>
+              <w:left w:type="dxa" w:w="90"/>
+              <w:bottom w:type="dxa" w:w="70"/>
+              <w:right w:type="dxa" w:w="90"/>
+            </w:tcMar>
+          </w:tcPr>
+          <w:p>
+            <w:pPr>
+              <w:spacing w:after="40"/>
+              <w:jc w:val="left"/>
+            </w:pPr>
+            <w:r>
+              <w:rPr>
+                <w:rFonts w:ascii="Times New Roman" w:cs="Times New Roman" w:eastAsia="Times New Roman" w:hAnsi="Times New Roman"/>
+                <w:sz w:val="20"/>
+                <w:szCs w:val="20"/>
+              </w:rPr>
+              <w:t xml:space="preserve">20</w:t>
+            </w:r>
+          </w:p>
+        </w:tc>
+        <w:tc>
+          <w:tcPr>
+            <w:tcW w:type="dxa" w:w="2100"/>
+            <w:tcMar>
+              <w:top w:type="dxa" w:w="70"/>
+              <w:left w:type="dxa" w:w="90"/>
+              <w:bottom w:type="dxa" w:w="70"/>
+              <w:right w:type="dxa" w:w="90"/>
+            </w:tcMar>
+          </w:tcPr>
+          <w:p>
+            <w:pPr>
+              <w:spacing w:after="40"/>
+              <w:jc w:val="left"/>
+            </w:pPr>
+            <w:r>
+              <w:rPr>
+                <w:rFonts w:ascii="Times New Roman" w:cs="Times New Roman" w:eastAsia="Times New Roman" w:hAnsi="Times New Roman"/>
+                <w:sz w:val="20"/>
+                <w:szCs w:val="20"/>
+              </w:rPr>
+              <w:t xml:space="preserve">Cabeceras duplicadas y contradictorias en las respuestas de /api/: "X-Frame-Options: SAMEORIGIN, DENY" y dos valores distintos de HSTS y Referrer-Policy</w:t>
+            </w:r>
+          </w:p>
+        </w:tc>
+        <w:tc>
+          <w:tcPr>
+            <w:tcW w:type="dxa" w:w="1500"/>
+            <w:tcMar>
+              <w:top w:type="dxa" w:w="70"/>
+              <w:left w:type="dxa" w:w="90"/>
+              <w:bottom w:type="dxa" w:w="70"/>
+              <w:right w:type="dxa" w:w="90"/>
+            </w:tcMar>
+          </w:tcPr>
+          <w:p>
+            <w:pPr>
+              <w:spacing w:after="40"/>
+              <w:jc w:val="left"/>
+            </w:pPr>
+            <w:r>
+              <w:rPr>
+                <w:rFonts w:ascii="Times New Roman" w:cs="Times New Roman" w:eastAsia="Times New Roman" w:hAnsi="Times New Roman"/>
+                <w:sz w:val="20"/>
+                <w:szCs w:val="20"/>
+              </w:rPr>
+              <w:t xml:space="preserve">Bajo / Medio — helmet (backend) y Nginx (borde) emitían las mismas cabeceras y el proxy las concatenaba. Ante valores contradictorios el navegador puede descartar la cabecera completa, anulando la protección</w:t>
+            </w:r>
+          </w:p>
+        </w:tc>
+        <w:tc>
+          <w:tcPr>
+            <w:tcW w:type="dxa" w:w="3200"/>
+            <w:tcMar>
+              <w:top w:type="dxa" w:w="70"/>
+              <w:left w:type="dxa" w:w="90"/>
+              <w:bottom w:type="dxa" w:w="70"/>
+              <w:right w:type="dxa" w:w="90"/>
+            </w:tcMar>
+          </w:tcPr>
+          <w:p>
+            <w:pPr>
+              <w:spacing w:after="40"/>
+              <w:jc w:val="left"/>
+            </w:pPr>
+            <w:r>
+              <w:rPr>
+                <w:rFonts w:ascii="Times New Roman" w:cs="Times New Roman" w:eastAsia="Times New Roman" w:hAnsi="Times New Roman"/>
+                <w:sz w:val="20"/>
+                <w:szCs w:val="20"/>
+              </w:rPr>
+              <w:t xml:space="preserve">proxy_hide_header para las ocho cabeceras que ambos emiten, de modo que Nginx queda como única fuente en el borde. Se mantiene helmet en el backend como defensa en profundidad, por si la API llegara a exponerse de forma directa</w:t>
+            </w:r>
+          </w:p>
+        </w:tc>
+        <w:tc>
+          <w:tcPr>
+            <w:tcW w:type="dxa" w:w="1780"/>
+            <w:tcMar>
+              <w:top w:type="dxa" w:w="70"/>
+              <w:left w:type="dxa" w:w="90"/>
+              <w:bottom w:type="dxa" w:w="70"/>
+              <w:right w:type="dxa" w:w="90"/>
+            </w:tcMar>
+          </w:tcPr>
+          <w:p>
+            <w:pPr>
+              <w:spacing w:after="40"/>
+              <w:jc w:val="left"/>
+            </w:pPr>
+            <w:r>
+              <w:rPr>
+                <w:rFonts w:ascii="Times New Roman" w:cs="Times New Roman" w:eastAsia="Times New Roman" w:hAnsi="Times New Roman"/>
+                <w:sz w:val="20"/>
+                <w:szCs w:val="20"/>
+              </w:rPr>
+              <w:t xml:space="preserve">Las respuestas de /api/ presentan un único valor por cabecera</w:t>
+            </w:r>
+          </w:p>
+        </w:tc>
+      </w:tr>
+      <w:tr>
+        <w:tc>
+          <w:tcPr>
+            <w:tcW w:type="dxa" w:w="420"/>
+            <w:tcMar>
+              <w:top w:type="dxa" w:w="70"/>
+              <w:left w:type="dxa" w:w="90"/>
+              <w:bottom w:type="dxa" w:w="70"/>
+              <w:right w:type="dxa" w:w="90"/>
+            </w:tcMar>
+          </w:tcPr>
+          <w:p>
+            <w:pPr>
+              <w:spacing w:after="40"/>
+              <w:jc w:val="left"/>
+            </w:pPr>
+            <w:r>
+              <w:rPr>
+                <w:rFonts w:ascii="Times New Roman" w:cs="Times New Roman" w:eastAsia="Times New Roman" w:hAnsi="Times New Roman"/>
+                <w:sz w:val="20"/>
+                <w:szCs w:val="20"/>
+              </w:rPr>
+              <w:t xml:space="preserve">21</w:t>
+            </w:r>
+          </w:p>
+        </w:tc>
+        <w:tc>
+          <w:tcPr>
+            <w:tcW w:type="dxa" w:w="2100"/>
+            <w:tcMar>
+              <w:top w:type="dxa" w:w="70"/>
+              <w:left w:type="dxa" w:w="90"/>
+              <w:bottom w:type="dxa" w:w="70"/>
+              <w:right w:type="dxa" w:w="90"/>
+            </w:tcMar>
+          </w:tcPr>
+          <w:p>
+            <w:pPr>
+              <w:spacing w:after="40"/>
+              <w:jc w:val="left"/>
+            </w:pPr>
+            <w:r>
+              <w:rPr>
+                <w:rFonts w:ascii="Times New Roman" w:cs="Times New Roman" w:eastAsia="Times New Roman" w:hAnsi="Times New Roman"/>
+                <w:sz w:val="20"/>
+                <w:szCs w:val="20"/>
+              </w:rPr>
+              <w:t xml:space="preserve">/favicon.ico devolvía el index.html con Content-Type: text/html y código 200, por el fallback del SPA</w:t>
+            </w:r>
+          </w:p>
+        </w:tc>
+        <w:tc>
+          <w:tcPr>
+            <w:tcW w:type="dxa" w:w="1500"/>
+            <w:tcMar>
+              <w:top w:type="dxa" w:w="70"/>
+              <w:left w:type="dxa" w:w="90"/>
+              <w:bottom w:type="dxa" w:w="70"/>
+              <w:right w:type="dxa" w:w="90"/>
+            </w:tcMar>
+          </w:tcPr>
+          <w:p>
+            <w:pPr>
+              <w:spacing w:after="40"/>
+              <w:jc w:val="left"/>
+            </w:pPr>
+            <w:r>
+              <w:rPr>
+                <w:rFonts w:ascii="Times New Roman" w:cs="Times New Roman" w:eastAsia="Times New Roman" w:hAnsi="Times New Roman"/>
+                <w:sz w:val="20"/>
+                <w:szCs w:val="20"/>
+              </w:rPr>
+              <w:t xml:space="preserve">Bajo — sirve HTML donde el navegador espera una imagen (confusión de tipo de contenido, ya mitigada por nosniff)</w:t>
+            </w:r>
+          </w:p>
+        </w:tc>
+        <w:tc>
+          <w:tcPr>
+            <w:tcW w:type="dxa" w:w="3200"/>
+            <w:tcMar>
+              <w:top w:type="dxa" w:w="70"/>
+              <w:left w:type="dxa" w:w="90"/>
+              <w:bottom w:type="dxa" w:w="70"/>
+              <w:right w:type="dxa" w:w="90"/>
+            </w:tcMar>
+          </w:tcPr>
+          <w:p>
+            <w:pPr>
+              <w:spacing w:after="40"/>
+              <w:jc w:val="left"/>
+            </w:pPr>
+            <w:r>
+              <w:rPr>
+                <w:rFonts w:ascii="Times New Roman" w:cs="Times New Roman" w:eastAsia="Times New Roman" w:hAnsi="Times New Roman"/>
+                <w:sz w:val="20"/>
+                <w:szCs w:val="20"/>
+              </w:rPr>
+              <w:t xml:space="preserve">location = /favicon.ico responde 204 sin registrar el acceso</w:t>
+            </w:r>
+          </w:p>
+        </w:tc>
+        <w:tc>
+          <w:tcPr>
+            <w:tcW w:type="dxa" w:w="1780"/>
+            <w:tcMar>
+              <w:top w:type="dxa" w:w="70"/>
+              <w:left w:type="dxa" w:w="90"/>
+              <w:bottom w:type="dxa" w:w="70"/>
+              <w:right w:type="dxa" w:w="90"/>
+            </w:tcMar>
+          </w:tcPr>
+          <w:p>
+            <w:pPr>
+              <w:spacing w:after="40"/>
+              <w:jc w:val="left"/>
+            </w:pPr>
+            <w:r>
+              <w:rPr>
+                <w:rFonts w:ascii="Times New Roman" w:cs="Times New Roman" w:eastAsia="Times New Roman" w:hAnsi="Times New Roman"/>
+                <w:sz w:val="20"/>
+                <w:szCs w:val="20"/>
+              </w:rPr>
+              <w:t xml:space="preserve">La ruta ya no devuelve HTML</w:t>
+            </w:r>
+          </w:p>
+        </w:tc>
+      </w:tr>
+    </w:tbl>
+    <w:p>
+      <w:pPr>
+        <w:spacing w:after="160" w:line="320"/>
+        <w:jc w:val="both"/>
+      </w:pPr>
+      <w:r>
+        <w:rPr>
+          <w:rFonts w:ascii="Times New Roman" w:cs="Times New Roman" w:eastAsia="Times New Roman" w:hAnsi="Times New Roman"/>
+          <w:sz w:val="24"/>
+          <w:szCs w:val="24"/>
+        </w:rPr>
+        <w:t xml:space="preserve">Este ciclo —escaneo, corrección, re-escaneo y corrección de residuos— es el que corresponde a una auditoría real: la verificación con una herramienta independiente encontró detalles que la revisión manual había dejado pasar.</w:t>
+      </w:r>
+    </w:p>
+    <w:p>
       <w:r>
         <w:br w:type="page"/>
       </w:r>
@@ -6766,7 +7244,7 @@
           <w:sz w:val="24"/>
           <w:szCs w:val="24"/>
         </w:rPr>
-        <w:t xml:space="preserve">Además, el servicio se sometió a una auditoría de seguridad posterior a la puesta en producción (sección 5) que combinó un escaneo externo con una revisión manual del código. Se identificaron y corrigieron 19 hallazgos, entre ellos tres de riesgo alto: la ausencia de cifrado en tránsito —resuelta con HTTPS y certificado de Let's Encrypt—, un XSS real en el filtro del frontend y una política CORS abierta a cualquier origen. El endurecimiento alcanzó las cuatro capas del sistema: transporte, aplicación, contenedores y sistema operativo. Los controles se incorporaron al propio pipeline (auditoría de dependencias y validación de la configuración de Nginx en cada build) para que las correcciones no se degraden con el tiempo. Todo el proceso quedó documentado como bitácora real, incluyendo los problemas encontrados y su resolución.</w:t>
+        <w:t xml:space="preserve">Además, el servicio se sometió a una auditoría de seguridad posterior a la puesta en producción (sección 5) que combinó un escaneo externo con una revisión manual del código. Se identificaron y corrigieron 21 hallazgos, entre ellos tres de riesgo alto: la ausencia de cifrado en tránsito —resuelta con HTTPS y certificado de Let's Encrypt—, un XSS real en el filtro del frontend y una política CORS abierta a cualquier origen. El endurecimiento alcanzó las cuatro capas del sistema: transporte, aplicación, contenedores y sistema operativo. Los controles se incorporaron al propio pipeline (auditoría de dependencias y validación de la configuración de Nginx en cada build) para que las correcciones no se degraden con el tiempo. Todo el proceso quedó documentado como bitácora real, incluyendo los problemas encontrados y su resolución.</w:t>
       </w:r>
     </w:p>
     <w:p>

</xml_diff>